<commit_message>
completed activity5 once again
</commit_message>
<xml_diff>
--- a/activity5/1.docx
+++ b/activity5/1.docx
@@ -112,9 +112,9 @@
           <w:noProof/>
         </w:rPr>
         <w:drawing>
-          <wp:inline distT="0" distB="0" distL="0" distR="0" wp14:anchorId="6D17F198" wp14:editId="1A2DEC4B">
-            <wp:extent cx="5731510" cy="3727450"/>
-            <wp:effectExtent l="0" t="0" r="0" b="6350"/>
+          <wp:inline distT="0" distB="0" distL="0" distR="0" wp14:anchorId="6D17F198" wp14:editId="2455708A">
+            <wp:extent cx="5938520" cy="3971637"/>
+            <wp:effectExtent l="0" t="0" r="5080" b="3810"/>
             <wp:docPr id="193508706" name="Picture 3"/>
             <wp:cNvGraphicFramePr>
               <a:graphicFrameLocks xmlns:a="http://schemas.openxmlformats.org/drawingml/2006/main" noChangeAspect="1"/>
@@ -141,7 +141,7 @@
                   <pic:spPr>
                     <a:xfrm>
                       <a:off x="0" y="0"/>
-                      <a:ext cx="5731510" cy="3727450"/>
+                      <a:ext cx="5954305" cy="3982194"/>
                     </a:xfrm>
                     <a:prstGeom prst="rect">
                       <a:avLst/>
@@ -161,9 +161,9 @@
           <w:noProof/>
         </w:rPr>
         <w:drawing>
-          <wp:inline distT="0" distB="0" distL="0" distR="0" wp14:anchorId="52608438" wp14:editId="210D66D0">
-            <wp:extent cx="5731510" cy="3727450"/>
-            <wp:effectExtent l="0" t="0" r="0" b="6350"/>
+          <wp:inline distT="0" distB="0" distL="0" distR="0" wp14:anchorId="52608438" wp14:editId="5EF8893F">
+            <wp:extent cx="5938520" cy="4091709"/>
+            <wp:effectExtent l="0" t="0" r="5080" b="0"/>
             <wp:docPr id="320049534" name="Picture 4"/>
             <wp:cNvGraphicFramePr>
               <a:graphicFrameLocks xmlns:a="http://schemas.openxmlformats.org/drawingml/2006/main" noChangeAspect="1"/>
@@ -190,7 +190,7 @@
                   <pic:spPr>
                     <a:xfrm>
                       <a:off x="0" y="0"/>
-                      <a:ext cx="5731510" cy="3727450"/>
+                      <a:ext cx="5947103" cy="4097623"/>
                     </a:xfrm>
                     <a:prstGeom prst="rect">
                       <a:avLst/>
@@ -216,8 +216,8 @@
           <w:noProof/>
         </w:rPr>
         <w:drawing>
-          <wp:inline distT="0" distB="0" distL="0" distR="0" wp14:anchorId="10A67F31" wp14:editId="7C3F3CD3">
-            <wp:extent cx="5731510" cy="3727450"/>
+          <wp:inline distT="0" distB="0" distL="0" distR="0" wp14:anchorId="10A67F31" wp14:editId="1EFCDAA3">
+            <wp:extent cx="5956935" cy="4147128"/>
             <wp:effectExtent l="0" t="0" r="0" b="6350"/>
             <wp:docPr id="2018037795" name="Picture 5"/>
             <wp:cNvGraphicFramePr>
@@ -245,7 +245,7 @@
                   <pic:spPr>
                     <a:xfrm>
                       <a:off x="0" y="0"/>
-                      <a:ext cx="5731510" cy="3727450"/>
+                      <a:ext cx="5967728" cy="4154642"/>
                     </a:xfrm>
                     <a:prstGeom prst="rect">
                       <a:avLst/>
@@ -265,9 +265,9 @@
           <w:noProof/>
         </w:rPr>
         <w:drawing>
-          <wp:inline distT="0" distB="0" distL="0" distR="0" wp14:anchorId="41A7A299" wp14:editId="76E2F789">
-            <wp:extent cx="5731510" cy="3727450"/>
-            <wp:effectExtent l="0" t="0" r="0" b="6350"/>
+          <wp:inline distT="0" distB="0" distL="0" distR="0" wp14:anchorId="41A7A299" wp14:editId="016EF36E">
+            <wp:extent cx="5956935" cy="4100946"/>
+            <wp:effectExtent l="0" t="0" r="0" b="1270"/>
             <wp:docPr id="1217552921" name="Picture 6"/>
             <wp:cNvGraphicFramePr>
               <a:graphicFrameLocks xmlns:a="http://schemas.openxmlformats.org/drawingml/2006/main" noChangeAspect="1"/>
@@ -294,7 +294,7 @@
                   <pic:spPr>
                     <a:xfrm>
                       <a:off x="0" y="0"/>
-                      <a:ext cx="5731510" cy="3727450"/>
+                      <a:ext cx="5965796" cy="4107046"/>
                     </a:xfrm>
                     <a:prstGeom prst="rect">
                       <a:avLst/>
@@ -307,6 +307,64 @@
         </w:drawing>
       </w:r>
     </w:p>
+    <w:p>
+      <w:pPr>
+        <w:rPr>
+          <w:rFonts w:ascii="Times New Roman" w:eastAsia="Times New Roman" w:hAnsi="Times New Roman" w:cs="Times New Roman"/>
+          <w:b/>
+          <w:bCs/>
+          <w:i/>
+          <w:iCs/>
+          <w:kern w:val="0"/>
+          <w:sz w:val="32"/>
+          <w:szCs w:val="32"/>
+          <w:lang w:eastAsia="en-GB"/>
+          <w14:ligatures w14:val="none"/>
+        </w:rPr>
+      </w:pPr>
+      <w:r>
+        <w:rPr>
+          <w:rFonts w:ascii="Times New Roman" w:hAnsi="Times New Roman" w:cs="Times New Roman"/>
+          <w:b/>
+          <w:bCs/>
+          <w:sz w:val="32"/>
+          <w:szCs w:val="32"/>
+        </w:rPr>
+        <w:lastRenderedPageBreak/>
+        <w:t xml:space="preserve">Public LinkedIn URL : </w:t>
+      </w:r>
+      <w:hyperlink r:id="rId10" w:history="1">
+        <w:r>
+          <w:rPr>
+            <w:rStyle w:val="Hyperlink"/>
+            <w:rFonts w:ascii="Times New Roman" w:eastAsia="Times New Roman" w:hAnsi="Times New Roman" w:cs="Times New Roman"/>
+            <w:b/>
+            <w:bCs/>
+            <w:i/>
+            <w:iCs/>
+            <w:kern w:val="0"/>
+            <w:lang w:eastAsia="en-GB"/>
+            <w14:ligatures w14:val="none"/>
+          </w:rPr>
+          <w:t>www.linkedin.com/in/</w:t>
+        </w:r>
+        <w:r>
+          <w:rPr>
+            <w:rStyle w:val="Hyperlink"/>
+            <w:rFonts w:ascii="Times New Roman" w:eastAsia="Times New Roman" w:hAnsi="Times New Roman" w:cs="Times New Roman"/>
+            <w:b/>
+            <w:bCs/>
+            <w:i/>
+            <w:iCs/>
+            <w:kern w:val="0"/>
+            <w:lang w:eastAsia="en-GB"/>
+            <w14:ligatures w14:val="none"/>
+          </w:rPr>
+          <w:t>prajwalShrikrishnaNaik</w:t>
+        </w:r>
+      </w:hyperlink>
+    </w:p>
+    <w:p/>
     <w:sectPr>
       <w:pgSz w:w="11906" w:h="16838"/>
       <w:pgMar w:top="1440" w:right="1440" w:bottom="1440" w:left="1440" w:header="708" w:footer="708" w:gutter="0"/>
@@ -1234,6 +1292,34 @@
       <w:spacing w:val="5"/>
     </w:rPr>
   </w:style>
+  <w:style w:type="character" w:customStyle="1" w:styleId="vanity-namedomain">
+    <w:name w:val="vanity-name__domain"/>
+    <w:basedOn w:val="DefaultParagraphFont"/>
+    <w:rsid w:val="0007249B"/>
+  </w:style>
+  <w:style w:type="character" w:styleId="Hyperlink">
+    <w:name w:val="Hyperlink"/>
+    <w:basedOn w:val="DefaultParagraphFont"/>
+    <w:uiPriority w:val="99"/>
+    <w:unhideWhenUsed/>
+    <w:rsid w:val="0007249B"/>
+    <w:rPr>
+      <w:color w:val="467886" w:themeColor="hyperlink"/>
+      <w:u w:val="single"/>
+    </w:rPr>
+  </w:style>
+  <w:style w:type="character" w:styleId="UnresolvedMention">
+    <w:name w:val="Unresolved Mention"/>
+    <w:basedOn w:val="DefaultParagraphFont"/>
+    <w:uiPriority w:val="99"/>
+    <w:semiHidden/>
+    <w:unhideWhenUsed/>
+    <w:rsid w:val="0007249B"/>
+    <w:rPr>
+      <w:color w:val="605E5C"/>
+      <w:shd w:val="clear" w:color="auto" w:fill="E1DFDD"/>
+    </w:rPr>
+  </w:style>
 </w:styles>
 </file>
 

</xml_diff>